<commit_message>
Update Task Info 03; Add Business Requirements; Add User Requirements; Add Functional & Non-Functional Requirement
</commit_message>
<xml_diff>
--- a/Documentation/Analysis/Task Informations/Task Info 03 - W.docx
+++ b/Documentation/Analysis/Task Informations/Task Info 03 - W.docx
@@ -263,7 +263,7 @@
               <w:rPr>
                 <w:rFonts w:ascii="Calibri" w:hAnsi="Calibri" w:cs="Calibri"/>
               </w:rPr>
-              <w:t>NA</w:t>
+              <w:t>1405/01/28</w:t>
             </w:r>
           </w:p>
         </w:tc>
@@ -401,13 +401,89 @@
             <w:pPr>
               <w:rPr>
                 <w:rFonts w:ascii="Calibri" w:hAnsi="Calibri" w:cs="Calibri"/>
+                <w:sz w:val="22"/>
+                <w:szCs w:val="22"/>
+              </w:rPr>
+            </w:pPr>
+            <w:proofErr w:type="spellStart"/>
+            <w:r>
+              <w:rPr>
+                <w:rFonts w:ascii="Calibri" w:hAnsi="Calibri" w:cs="Calibri"/>
+                <w:sz w:val="22"/>
+                <w:szCs w:val="22"/>
+              </w:rPr>
+              <w:t>BusinessRequirements</w:t>
+            </w:r>
+            <w:proofErr w:type="spellEnd"/>
+            <w:r>
+              <w:rPr>
+                <w:rFonts w:ascii="Calibri" w:hAnsi="Calibri" w:cs="Calibri"/>
+                <w:sz w:val="22"/>
+                <w:szCs w:val="22"/>
+              </w:rPr>
+              <w:t xml:space="preserve"> - W.docx</w:t>
+            </w:r>
+          </w:p>
+          <w:p>
+            <w:pPr>
+              <w:rPr>
+                <w:rFonts w:ascii="Calibri" w:hAnsi="Calibri" w:cs="Calibri"/>
+                <w:sz w:val="22"/>
+                <w:szCs w:val="22"/>
+              </w:rPr>
+            </w:pPr>
+            <w:proofErr w:type="spellStart"/>
+            <w:r>
+              <w:rPr>
+                <w:rFonts w:ascii="Calibri" w:hAnsi="Calibri" w:cs="Calibri"/>
+                <w:sz w:val="22"/>
+                <w:szCs w:val="22"/>
+              </w:rPr>
+              <w:t>UserRequirements</w:t>
+            </w:r>
+            <w:proofErr w:type="spellEnd"/>
+            <w:r>
+              <w:rPr>
+                <w:rFonts w:ascii="Calibri" w:hAnsi="Calibri" w:cs="Calibri"/>
+                <w:sz w:val="22"/>
+                <w:szCs w:val="22"/>
+              </w:rPr>
+              <w:t xml:space="preserve"> - W.docx</w:t>
+            </w:r>
+          </w:p>
+          <w:p>
+            <w:pPr>
+              <w:rPr>
+                <w:rFonts w:ascii="Calibri" w:hAnsi="Calibri" w:cs="Calibri"/>
+                <w:sz w:val="22"/>
+                <w:szCs w:val="22"/>
               </w:rPr>
             </w:pPr>
             <w:r>
               <w:rPr>
                 <w:rFonts w:ascii="Calibri" w:hAnsi="Calibri" w:cs="Calibri"/>
-              </w:rPr>
-              <w:t>Requirements Analysis – W.docx</w:t>
+                <w:sz w:val="22"/>
+                <w:szCs w:val="22"/>
+              </w:rPr>
+              <w:t>Functional-</w:t>
+            </w:r>
+            <w:proofErr w:type="spellStart"/>
+            <w:r>
+              <w:rPr>
+                <w:rFonts w:ascii="Calibri" w:hAnsi="Calibri" w:cs="Calibri"/>
+                <w:sz w:val="22"/>
+                <w:szCs w:val="22"/>
+              </w:rPr>
+              <w:t>NonFunctional</w:t>
+            </w:r>
+            <w:proofErr w:type="spellEnd"/>
+            <w:r>
+              <w:rPr>
+                <w:rFonts w:ascii="Calibri" w:hAnsi="Calibri" w:cs="Calibri"/>
+                <w:sz w:val="22"/>
+                <w:szCs w:val="22"/>
+              </w:rPr>
+              <w:t xml:space="preserve"> Requirement - W.docx</w:t>
             </w:r>
           </w:p>
         </w:tc>
@@ -477,9 +553,19 @@
             </w:pPr>
             <w:r>
               <w:rPr>
-                <w:rFonts w:ascii="Calibri" w:hAnsi="Calibri" w:cs="Calibri"/>
-              </w:rPr>
-              <w:t>In progress</w:t>
+                <w:rFonts w:ascii="Calibri" w:hAnsi="Calibri" w:cs="Arial Unicode MS"/>
+                <w:color w:val="000000"/>
+                <w:kern w:val="2"/>
+                <w:sz w:val="28"/>
+                <w:szCs w:val="28"/>
+                <w:u w:color="000000"/>
+                <w14:textOutline w14:w="0" w14:cap="flat" w14:cmpd="sng" w14:algn="ctr">
+                  <w14:noFill/>
+                  <w14:prstDash w14:val="solid"/>
+                  <w14:bevel/>
+                </w14:textOutline>
+              </w:rPr>
+              <w:t>Completed</w:t>
             </w:r>
           </w:p>
         </w:tc>
@@ -691,6 +777,12 @@
                 <w:rFonts w:ascii="Calibri" w:hAnsi="Calibri" w:cs="Calibri"/>
               </w:rPr>
             </w:pPr>
+            <w:r>
+              <w:rPr>
+                <w:rFonts w:ascii="Calibri" w:hAnsi="Calibri" w:cs="Calibri"/>
+              </w:rPr>
+              <w:t>6.5</w:t>
+            </w:r>
           </w:p>
         </w:tc>
         <w:tc>
@@ -761,7 +853,7 @@
               <w:rPr>
                 <w:rFonts w:ascii="Calibri" w:hAnsi="Calibri" w:cs="Calibri"/>
               </w:rPr>
-              <w:t>NA</w:t>
+              <w:t>5</w:t>
             </w:r>
           </w:p>
         </w:tc>
@@ -852,7 +944,6 @@
           <w:lang w:val="ar-SA"/>
         </w:rPr>
       </w:pPr>
-      <w:proofErr w:type="spellStart"/>
       <w:r>
         <w:rPr>
           <w:rFonts w:cs="Arial"/>
@@ -863,254 +954,7 @@
           <w:rtl/>
           <w:lang w:val="ar-SA"/>
         </w:rPr>
-        <w:t>برای</w:t>
-      </w:r>
-      <w:proofErr w:type="spellEnd"/>
-      <w:r>
-        <w:rPr>
-          <w:rFonts w:cs="Arial"/>
-          <w:color w:val="EE0000"/>
-          <w:sz w:val="28"/>
-          <w:szCs w:val="28"/>
-          <w:u w:color="EE0000"/>
-          <w:rtl/>
-          <w:lang w:val="ar-SA"/>
-        </w:rPr>
-        <w:t xml:space="preserve"> هر </w:t>
-      </w:r>
-      <w:proofErr w:type="spellStart"/>
-      <w:r>
-        <w:rPr>
-          <w:rFonts w:cs="Arial"/>
-          <w:color w:val="EE0000"/>
-          <w:sz w:val="28"/>
-          <w:szCs w:val="28"/>
-          <w:u w:color="EE0000"/>
-          <w:rtl/>
-          <w:lang w:val="ar-SA"/>
-        </w:rPr>
-        <w:t>کدام</w:t>
-      </w:r>
-      <w:proofErr w:type="spellEnd"/>
-      <w:r>
-        <w:rPr>
-          <w:rFonts w:cs="Arial"/>
-          <w:color w:val="EE0000"/>
-          <w:sz w:val="28"/>
-          <w:szCs w:val="28"/>
-          <w:u w:color="EE0000"/>
-          <w:rtl/>
-          <w:lang w:val="ar-SA"/>
-        </w:rPr>
-        <w:t xml:space="preserve"> از </w:t>
-      </w:r>
-      <w:proofErr w:type="spellStart"/>
-      <w:r>
-        <w:rPr>
-          <w:rFonts w:cs="Arial"/>
-          <w:color w:val="EE0000"/>
-          <w:sz w:val="28"/>
-          <w:szCs w:val="28"/>
-          <w:u w:color="EE0000"/>
-          <w:rtl/>
-          <w:lang w:val="ar-SA"/>
-        </w:rPr>
-        <w:t>تسک</w:t>
-      </w:r>
-      <w:proofErr w:type="spellEnd"/>
-      <w:r>
-        <w:rPr>
-          <w:rFonts w:cs="Arial"/>
-          <w:color w:val="EE0000"/>
-          <w:sz w:val="28"/>
-          <w:szCs w:val="28"/>
-          <w:u w:color="EE0000"/>
-          <w:rtl/>
-          <w:lang w:val="ar-SA"/>
-        </w:rPr>
-        <w:t xml:space="preserve"> </w:t>
-      </w:r>
-      <w:proofErr w:type="spellStart"/>
-      <w:r>
-        <w:rPr>
-          <w:rFonts w:cs="Arial"/>
-          <w:color w:val="EE0000"/>
-          <w:sz w:val="28"/>
-          <w:szCs w:val="28"/>
-          <w:u w:color="EE0000"/>
-          <w:rtl/>
-          <w:lang w:val="ar-SA"/>
-        </w:rPr>
-        <w:t>هایمان</w:t>
-      </w:r>
-      <w:proofErr w:type="spellEnd"/>
-      <w:r>
-        <w:rPr>
-          <w:rFonts w:cs="Arial"/>
-          <w:color w:val="EE0000"/>
-          <w:sz w:val="28"/>
-          <w:szCs w:val="28"/>
-          <w:u w:color="EE0000"/>
-          <w:rtl/>
-          <w:lang w:val="ar-SA"/>
-        </w:rPr>
-        <w:t xml:space="preserve"> در </w:t>
-      </w:r>
-      <w:proofErr w:type="spellStart"/>
-      <w:r>
-        <w:rPr>
-          <w:rFonts w:cs="Arial"/>
-          <w:color w:val="EE0000"/>
-          <w:sz w:val="28"/>
-          <w:szCs w:val="28"/>
-          <w:u w:color="EE0000"/>
-          <w:rtl/>
-          <w:lang w:val="ar-SA"/>
-        </w:rPr>
-        <w:t>پروژه</w:t>
-      </w:r>
-      <w:proofErr w:type="spellEnd"/>
-      <w:r>
-        <w:rPr>
-          <w:rFonts w:cs="Arial"/>
-          <w:color w:val="EE0000"/>
-          <w:sz w:val="28"/>
-          <w:szCs w:val="28"/>
-          <w:u w:color="EE0000"/>
-          <w:rtl/>
-          <w:lang w:val="ar-SA"/>
-        </w:rPr>
-        <w:t xml:space="preserve"> اين را </w:t>
-      </w:r>
-      <w:proofErr w:type="spellStart"/>
-      <w:r>
-        <w:rPr>
-          <w:rFonts w:cs="Arial"/>
-          <w:color w:val="EE0000"/>
-          <w:sz w:val="28"/>
-          <w:szCs w:val="28"/>
-          <w:u w:color="EE0000"/>
-          <w:rtl/>
-          <w:lang w:val="ar-SA"/>
-        </w:rPr>
-        <w:t>تکمیل</w:t>
-      </w:r>
-      <w:proofErr w:type="spellEnd"/>
-      <w:r>
-        <w:rPr>
-          <w:rFonts w:cs="Arial"/>
-          <w:color w:val="EE0000"/>
-          <w:sz w:val="28"/>
-          <w:szCs w:val="28"/>
-          <w:u w:color="EE0000"/>
-          <w:rtl/>
-          <w:lang w:val="ar-SA"/>
-        </w:rPr>
-        <w:t xml:space="preserve"> </w:t>
-      </w:r>
-      <w:proofErr w:type="spellStart"/>
-      <w:r>
-        <w:rPr>
-          <w:rFonts w:cs="Arial"/>
-          <w:color w:val="EE0000"/>
-          <w:sz w:val="28"/>
-          <w:szCs w:val="28"/>
-          <w:u w:color="EE0000"/>
-          <w:rtl/>
-          <w:lang w:val="ar-SA"/>
-        </w:rPr>
-        <w:t>کنیم</w:t>
-      </w:r>
-      <w:proofErr w:type="spellEnd"/>
-      <w:r>
-        <w:rPr>
-          <w:rFonts w:cs="Arial"/>
-          <w:color w:val="EE0000"/>
-          <w:sz w:val="28"/>
-          <w:szCs w:val="28"/>
-          <w:u w:color="EE0000"/>
-          <w:rtl/>
-          <w:lang w:val="ar-SA"/>
-        </w:rPr>
-        <w:t xml:space="preserve"> </w:t>
-      </w:r>
-      <w:proofErr w:type="gramStart"/>
-      <w:r>
-        <w:rPr>
-          <w:rFonts w:cs="Arial"/>
-          <w:color w:val="EE0000"/>
-          <w:sz w:val="28"/>
-          <w:szCs w:val="28"/>
-          <w:u w:color="EE0000"/>
-          <w:rtl/>
-          <w:lang w:val="ar-SA"/>
-        </w:rPr>
-        <w:t>و در</w:t>
-      </w:r>
-      <w:proofErr w:type="gramEnd"/>
-      <w:r>
-        <w:rPr>
-          <w:rFonts w:cs="Arial"/>
-          <w:color w:val="EE0000"/>
-          <w:sz w:val="28"/>
-          <w:szCs w:val="28"/>
-          <w:u w:color="EE0000"/>
-          <w:rtl/>
-          <w:lang w:val="ar-SA"/>
-        </w:rPr>
-        <w:t xml:space="preserve"> </w:t>
-      </w:r>
-      <w:proofErr w:type="spellStart"/>
-      <w:r>
-        <w:rPr>
-          <w:rFonts w:cs="Arial"/>
-          <w:color w:val="EE0000"/>
-          <w:sz w:val="28"/>
-          <w:szCs w:val="28"/>
-          <w:u w:color="EE0000"/>
-          <w:rtl/>
-          <w:lang w:val="ar-SA"/>
-        </w:rPr>
-        <w:t>داکیومنت</w:t>
-      </w:r>
-      <w:proofErr w:type="spellEnd"/>
-      <w:r>
-        <w:rPr>
-          <w:rFonts w:cs="Arial"/>
-          <w:color w:val="EE0000"/>
-          <w:sz w:val="28"/>
-          <w:szCs w:val="28"/>
-          <w:u w:color="EE0000"/>
-          <w:rtl/>
-          <w:lang w:val="ar-SA"/>
-        </w:rPr>
-        <w:t xml:space="preserve"> قرار </w:t>
-      </w:r>
-      <w:proofErr w:type="spellStart"/>
-      <w:r>
-        <w:rPr>
-          <w:rFonts w:cs="Arial"/>
-          <w:color w:val="EE0000"/>
-          <w:sz w:val="28"/>
-          <w:szCs w:val="28"/>
-          <w:u w:color="EE0000"/>
-          <w:rtl/>
-          <w:lang w:val="ar-SA"/>
-        </w:rPr>
-        <w:t>بدیم</w:t>
-      </w:r>
-      <w:proofErr w:type="spellEnd"/>
-      <w:r>
-        <w:rPr>
-          <w:rFonts w:cs="Arial"/>
-          <w:color w:val="EE0000"/>
-          <w:sz w:val="28"/>
-          <w:szCs w:val="28"/>
-          <w:u w:color="EE0000"/>
-          <w:rtl/>
-          <w:lang w:val="ar-SA"/>
-        </w:rPr>
-        <w:t xml:space="preserve"> </w:t>
+        <w:t xml:space="preserve">برای هر کدام از تسک هایمان در پروژه اين را تکمیل کنیم و در داکیومنت قرار بدیم </w:t>
       </w:r>
     </w:p>
     <w:p>
@@ -1141,33 +985,7 @@
           <w:rtl/>
           <w:lang w:val="ar-SA"/>
         </w:rPr>
-        <w:t xml:space="preserve">مثال </w:t>
-      </w:r>
-      <w:proofErr w:type="spellStart"/>
-      <w:r>
-        <w:rPr>
-          <w:rFonts w:cs="Arial"/>
-          <w:color w:val="EE0000"/>
-          <w:sz w:val="28"/>
-          <w:szCs w:val="28"/>
-          <w:u w:color="EE0000"/>
-          <w:rtl/>
-          <w:lang w:val="ar-SA"/>
-        </w:rPr>
-        <w:t>تکمیل</w:t>
-      </w:r>
-      <w:proofErr w:type="spellEnd"/>
-      <w:r>
-        <w:rPr>
-          <w:rFonts w:cs="Arial"/>
-          <w:color w:val="EE0000"/>
-          <w:sz w:val="28"/>
-          <w:szCs w:val="28"/>
-          <w:u w:color="EE0000"/>
-          <w:rtl/>
-          <w:lang w:val="ar-SA"/>
-        </w:rPr>
-        <w:t xml:space="preserve"> شده در صفحه </w:t>
+        <w:t xml:space="preserve">مثال تکمیل شده در صفحه </w:t>
       </w:r>
       <w:r>
         <w:rPr>
@@ -1191,33 +1009,7 @@
           <w:rtl/>
           <w:lang w:val="ar-SA"/>
         </w:rPr>
-        <w:t xml:space="preserve">فصل ۲ </w:t>
-      </w:r>
-      <w:proofErr w:type="spellStart"/>
-      <w:r>
-        <w:rPr>
-          <w:rFonts w:cs="Arial"/>
-          <w:color w:val="EE0000"/>
-          <w:sz w:val="28"/>
-          <w:szCs w:val="28"/>
-          <w:u w:color="EE0000"/>
-          <w:rtl/>
-          <w:lang w:val="ar-SA"/>
-        </w:rPr>
-        <w:t>آمده</w:t>
-      </w:r>
-      <w:proofErr w:type="spellEnd"/>
-      <w:r>
-        <w:rPr>
-          <w:rFonts w:cs="Arial"/>
-          <w:color w:val="EE0000"/>
-          <w:sz w:val="28"/>
-          <w:szCs w:val="28"/>
-          <w:u w:color="EE0000"/>
-          <w:rtl/>
-          <w:lang w:val="ar-SA"/>
-        </w:rPr>
-        <w:t xml:space="preserve"> است</w:t>
+        <w:t>فصل ۲ آمده است</w:t>
       </w:r>
     </w:p>
     <w:p>
@@ -1410,19 +1202,33 @@
         <w:pStyle w:val="Body"/>
         <w:rPr>
           <w:color w:val="EE0000"/>
-          <w:sz w:val="28"/>
-          <w:szCs w:val="28"/>
+          <w:szCs w:val="26"/>
           <w:u w:color="EE0000"/>
         </w:rPr>
       </w:pPr>
       <w:r>
         <w:rPr>
           <w:color w:val="EE0000"/>
-          <w:sz w:val="28"/>
-          <w:szCs w:val="28"/>
+          <w:szCs w:val="26"/>
           <w:u w:color="EE0000"/>
         </w:rPr>
-        <w:t>Optimistic estimate:</w:t>
+        <w:t xml:space="preserve">Optimistic estimate: </w:t>
+      </w:r>
+      <w:r>
+        <w:rPr>
+          <w:color w:val="EE0000"/>
+          <w:szCs w:val="26"/>
+          <w:u w:color="EE0000"/>
+        </w:rPr>
+        <w:t>3</w:t>
+      </w:r>
+      <w:r>
+        <w:rPr>
+          <w:color w:val="EE0000"/>
+          <w:szCs w:val="26"/>
+          <w:u w:color="EE0000"/>
+        </w:rPr>
+        <w:t>hour</w:t>
       </w:r>
     </w:p>
     <w:p>
@@ -1430,32 +1236,34 @@
         <w:pStyle w:val="Body"/>
         <w:rPr>
           <w:color w:val="EE0000"/>
-          <w:sz w:val="28"/>
-          <w:szCs w:val="28"/>
+          <w:szCs w:val="26"/>
           <w:u w:color="EE0000"/>
         </w:rPr>
       </w:pPr>
-      <w:proofErr w:type="spellStart"/>
       <w:r>
         <w:rPr>
           <w:color w:val="EE0000"/>
-          <w:sz w:val="28"/>
-          <w:szCs w:val="28"/>
+          <w:szCs w:val="26"/>
           <w:u w:color="EE0000"/>
           <w:lang w:val="it-IT"/>
         </w:rPr>
-        <w:t>Pessimistic</w:t>
+        <w:t xml:space="preserve">Pessimistic estimate: </w:t>
       </w:r>
-      <w:proofErr w:type="spellEnd"/>
       <w:r>
         <w:rPr>
           <w:color w:val="EE0000"/>
-          <w:sz w:val="28"/>
-          <w:szCs w:val="28"/>
+          <w:szCs w:val="26"/>
           <w:u w:color="EE0000"/>
-          <w:lang w:val="it-IT"/>
         </w:rPr>
-        <w:t xml:space="preserve"> estimate:</w:t>
+        <w:t>8</w:t>
+      </w:r>
+      <w:r>
+        <w:rPr>
+          <w:color w:val="EE0000"/>
+          <w:szCs w:val="26"/>
+          <w:u w:color="EE0000"/>
+        </w:rPr>
+        <w:t xml:space="preserve"> hours</w:t>
       </w:r>
     </w:p>
     <w:p>
@@ -1463,33 +1271,147 @@
         <w:pStyle w:val="Body"/>
         <w:rPr>
           <w:color w:val="EE0000"/>
-          <w:sz w:val="28"/>
-          <w:szCs w:val="28"/>
+          <w:szCs w:val="26"/>
           <w:u w:color="EE0000"/>
         </w:rPr>
       </w:pPr>
       <w:r>
         <w:rPr>
           <w:color w:val="EE0000"/>
-          <w:sz w:val="28"/>
-          <w:szCs w:val="28"/>
+          <w:szCs w:val="26"/>
           <w:u w:color="EE0000"/>
         </w:rPr>
-        <w:t>Most likely estimate:</w:t>
+        <w:t xml:space="preserve">Most likely estimate: </w:t>
+      </w:r>
+      <w:r>
+        <w:rPr>
+          <w:color w:val="EE0000"/>
+          <w:szCs w:val="26"/>
+          <w:u w:color="EE0000"/>
+        </w:rPr>
+        <w:t>7</w:t>
+      </w:r>
+      <w:r>
+        <w:rPr>
+          <w:color w:val="EE0000"/>
+          <w:szCs w:val="26"/>
+          <w:u w:color="EE0000"/>
+        </w:rPr>
+        <w:t xml:space="preserve"> hours</w:t>
       </w:r>
     </w:p>
     <w:p>
       <w:pPr>
         <w:pStyle w:val="Body"/>
+        <w:rPr>
+          <w:color w:val="EE0000"/>
+          <w:szCs w:val="22"/>
+        </w:rPr>
       </w:pPr>
       <w:r>
         <w:rPr>
           <w:color w:val="EE0000"/>
-          <w:sz w:val="28"/>
-          <w:szCs w:val="28"/>
+          <w:szCs w:val="26"/>
           <w:u w:color="EE0000"/>
         </w:rPr>
-        <w:t>Weighted average:</w:t>
+        <w:t xml:space="preserve">Weighted average: </w:t>
+      </w:r>
+      <m:oMath>
+        <m:f>
+          <m:fPr>
+            <m:ctrlPr>
+              <w:rPr>
+                <w:rFonts w:ascii="Cambria Math" w:hAnsi="Cambria Math"/>
+                <w:i/>
+                <w:color w:val="EE0000"/>
+                <w:sz w:val="28"/>
+                <w:szCs w:val="29"/>
+              </w:rPr>
+            </m:ctrlPr>
+          </m:fPr>
+          <m:num>
+            <m:r>
+              <w:rPr>
+                <w:rFonts w:ascii="Cambria Math" w:hAnsi="Cambria Math"/>
+                <w:color w:val="EE0000"/>
+                <w:sz w:val="28"/>
+                <w:szCs w:val="29"/>
+              </w:rPr>
+              <m:t>3</m:t>
+            </m:r>
+            <m:r>
+              <w:rPr>
+                <w:rFonts w:ascii="Cambria Math" w:hAnsi="Cambria Math"/>
+                <w:color w:val="EE0000"/>
+                <w:sz w:val="28"/>
+                <w:szCs w:val="29"/>
+              </w:rPr>
+              <m:t>+4×</m:t>
+            </m:r>
+            <m:r>
+              <w:rPr>
+                <w:rFonts w:ascii="Cambria Math" w:hAnsi="Cambria Math"/>
+                <w:color w:val="EE0000"/>
+                <w:sz w:val="28"/>
+                <w:szCs w:val="29"/>
+              </w:rPr>
+              <m:t>7</m:t>
+            </m:r>
+            <m:r>
+              <w:rPr>
+                <w:rFonts w:ascii="Cambria Math" w:hAnsi="Cambria Math"/>
+                <w:color w:val="EE0000"/>
+                <w:sz w:val="28"/>
+                <w:szCs w:val="29"/>
+              </w:rPr>
+              <m:t>+</m:t>
+            </m:r>
+            <m:r>
+              <w:rPr>
+                <w:rFonts w:ascii="Cambria Math" w:hAnsi="Cambria Math"/>
+                <w:color w:val="EE0000"/>
+                <w:sz w:val="28"/>
+                <w:szCs w:val="29"/>
+              </w:rPr>
+              <m:t>8</m:t>
+            </m:r>
+          </m:num>
+          <m:den>
+            <m:r>
+              <w:rPr>
+                <w:rFonts w:ascii="Cambria Math" w:hAnsi="Cambria Math"/>
+                <w:color w:val="EE0000"/>
+                <w:sz w:val="28"/>
+                <w:szCs w:val="29"/>
+              </w:rPr>
+              <m:t>6</m:t>
+            </m:r>
+          </m:den>
+        </m:f>
+      </m:oMath>
+      <w:r>
+        <w:rPr>
+          <w:color w:val="EE0000"/>
+          <w:szCs w:val="26"/>
+          <w:u w:color="EE0000"/>
+        </w:rPr>
+        <w:t xml:space="preserve"> = </w:t>
+      </w:r>
+      <w:r>
+        <w:rPr>
+          <w:color w:val="EE0000"/>
+          <w:szCs w:val="26"/>
+          <w:u w:color="EE0000"/>
+        </w:rPr>
+        <w:t>6.5</w:t>
+      </w:r>
+      <w:r>
+        <w:rPr>
+          <w:color w:val="EE0000"/>
+          <w:szCs w:val="26"/>
+          <w:u w:color="EE0000"/>
+        </w:rPr>
+        <w:t xml:space="preserve"> hours</w:t>
       </w:r>
     </w:p>
     <w:sectPr>

</xml_diff>

<commit_message>
Update Task Info 03
</commit_message>
<xml_diff>
--- a/Documentation/Analysis/Task Informations/Task Info 03 - W.docx
+++ b/Documentation/Analysis/Task Informations/Task Info 03 - W.docx
@@ -405,23 +405,13 @@
                 <w:szCs w:val="22"/>
               </w:rPr>
             </w:pPr>
-            <w:proofErr w:type="spellStart"/>
             <w:r>
               <w:rPr>
                 <w:rFonts w:ascii="Calibri" w:hAnsi="Calibri" w:cs="Calibri"/>
                 <w:sz w:val="22"/>
                 <w:szCs w:val="22"/>
               </w:rPr>
-              <w:t>BusinessRequirements</w:t>
-            </w:r>
-            <w:proofErr w:type="spellEnd"/>
-            <w:r>
-              <w:rPr>
-                <w:rFonts w:ascii="Calibri" w:hAnsi="Calibri" w:cs="Calibri"/>
-                <w:sz w:val="22"/>
-                <w:szCs w:val="22"/>
-              </w:rPr>
-              <w:t xml:space="preserve"> - W.docx</w:t>
+              <w:t>BusinessRequirements - W.docx</w:t>
             </w:r>
           </w:p>
           <w:p>
@@ -432,23 +422,13 @@
                 <w:szCs w:val="22"/>
               </w:rPr>
             </w:pPr>
-            <w:proofErr w:type="spellStart"/>
             <w:r>
               <w:rPr>
                 <w:rFonts w:ascii="Calibri" w:hAnsi="Calibri" w:cs="Calibri"/>
                 <w:sz w:val="22"/>
                 <w:szCs w:val="22"/>
               </w:rPr>
-              <w:t>UserRequirements</w:t>
-            </w:r>
-            <w:proofErr w:type="spellEnd"/>
-            <w:r>
-              <w:rPr>
-                <w:rFonts w:ascii="Calibri" w:hAnsi="Calibri" w:cs="Calibri"/>
-                <w:sz w:val="22"/>
-                <w:szCs w:val="22"/>
-              </w:rPr>
-              <w:t xml:space="preserve"> - W.docx</w:t>
+              <w:t>UserRequirements - W.docx</w:t>
             </w:r>
           </w:p>
           <w:p>
@@ -465,25 +445,7 @@
                 <w:sz w:val="22"/>
                 <w:szCs w:val="22"/>
               </w:rPr>
-              <w:t>Functional-</w:t>
-            </w:r>
-            <w:proofErr w:type="spellStart"/>
-            <w:r>
-              <w:rPr>
-                <w:rFonts w:ascii="Calibri" w:hAnsi="Calibri" w:cs="Calibri"/>
-                <w:sz w:val="22"/>
-                <w:szCs w:val="22"/>
-              </w:rPr>
-              <w:t>NonFunctional</w:t>
-            </w:r>
-            <w:proofErr w:type="spellEnd"/>
-            <w:r>
-              <w:rPr>
-                <w:rFonts w:ascii="Calibri" w:hAnsi="Calibri" w:cs="Calibri"/>
-                <w:sz w:val="22"/>
-                <w:szCs w:val="22"/>
-              </w:rPr>
-              <w:t xml:space="preserve"> Requirement - W.docx</w:t>
+              <w:t>Functional-NonFunctional Requirement - W.docx</w:t>
             </w:r>
           </w:p>
         </w:tc>
@@ -855,6 +817,12 @@
               </w:rPr>
               <w:t>5</w:t>
             </w:r>
+            <w:r>
+              <w:rPr>
+                <w:rFonts w:ascii="Calibri" w:hAnsi="Calibri" w:cs="Calibri"/>
+              </w:rPr>
+              <w:t>.5</w:t>
+            </w:r>
           </w:p>
         </w:tc>
         <w:tc>
@@ -912,19 +880,8 @@
           <w:szCs w:val="28"/>
           <w:u w:color="EE0000"/>
         </w:rPr>
-        <w:t xml:space="preserve">Task </w:t>
+        <w:t>Task Informaion</w:t>
       </w:r>
-      <w:proofErr w:type="spellStart"/>
-      <w:r>
-        <w:rPr>
-          <w:color w:val="EE0000"/>
-          <w:sz w:val="28"/>
-          <w:szCs w:val="28"/>
-          <w:u w:color="EE0000"/>
-        </w:rPr>
-        <w:t>Informaion</w:t>
-      </w:r>
-      <w:proofErr w:type="spellEnd"/>
     </w:p>
     <w:p>
       <w:pPr>
@@ -1337,43 +1294,7 @@
                 <w:sz w:val="28"/>
                 <w:szCs w:val="29"/>
               </w:rPr>
-              <m:t>3</m:t>
-            </m:r>
-            <m:r>
-              <w:rPr>
-                <w:rFonts w:ascii="Cambria Math" w:hAnsi="Cambria Math"/>
-                <w:color w:val="EE0000"/>
-                <w:sz w:val="28"/>
-                <w:szCs w:val="29"/>
-              </w:rPr>
-              <m:t>+4×</m:t>
-            </m:r>
-            <m:r>
-              <w:rPr>
-                <w:rFonts w:ascii="Cambria Math" w:hAnsi="Cambria Math"/>
-                <w:color w:val="EE0000"/>
-                <w:sz w:val="28"/>
-                <w:szCs w:val="29"/>
-              </w:rPr>
-              <m:t>7</m:t>
-            </m:r>
-            <m:r>
-              <w:rPr>
-                <w:rFonts w:ascii="Cambria Math" w:hAnsi="Cambria Math"/>
-                <w:color w:val="EE0000"/>
-                <w:sz w:val="28"/>
-                <w:szCs w:val="29"/>
-              </w:rPr>
-              <m:t>+</m:t>
-            </m:r>
-            <m:r>
-              <w:rPr>
-                <w:rFonts w:ascii="Cambria Math" w:hAnsi="Cambria Math"/>
-                <w:color w:val="EE0000"/>
-                <w:sz w:val="28"/>
-                <w:szCs w:val="29"/>
-              </w:rPr>
-              <m:t>8</m:t>
+              <m:t>3+4×7+8</m:t>
             </m:r>
           </m:num>
           <m:den>

</xml_diff>